<commit_message>
feat(web): Attachments step in the request wizard
Add a dedicated Attachments step (now 7 steps: … Economic, Attachments,
Review) so documents can be attached during creation. Uploading on a
brand-new request lazily creates the draft first (persist) then attaches,
swapping the URL to /requests/:id/edit; on an existing draft it uploads
directly. Files can be removed on the step, and Review shows the count.
Reuses the existing uploadAttachment/deleteAttachment API (DRAFT/REJECTED
only, any file type) — no backend change.

Verified: frontend vitest 44 pass (new tests: new-request upload creates
then attaches; existing-draft upload attaches without creating); tsc +
vite build clean. Drove the app end-to-end — attached a file during
creation on New Request, draft CX000107 was created with the file, then
deleted the test draft. SOP §6.1 + CLAUDE.md updated and Word SOP
regenerated.

Co-Authored-By: Claude Opus 4.8 (1M context) <noreply@anthropic.com>
</commit_message>
<xml_diff>
--- a/docs/CAPEX Flow SOP.docx
+++ b/docs/CAPEX Flow SOP.docx
@@ -1416,7 +1416,7 @@
         <w:t xml:space="preserve"> </w:t>
       </w:r>
       <w:r>
-        <w:t xml:space="preserve">— opens the 6-step wizard with a blank form.</w:t>
+        <w:t xml:space="preserve">— opens the 7-step wizard with a blank form.</w:t>
       </w:r>
       <w:r>
         <w:t xml:space="preserve"> </w:t>
@@ -1475,13 +1475,22 @@
         <w:t xml:space="preserve">Submit</w:t>
       </w:r>
       <w:r>
-        <w:t xml:space="preserve">, so opening New Request and leaving creates nothing. (The</w:t>
-      </w:r>
-      <w:r>
-        <w:t xml:space="preserve"> </w:t>
-      </w:r>
-      <w:r>
-        <w:t xml:space="preserve">request number is assigned when the draft is first saved.)</w:t>
+        <w:t xml:space="preserve"> </w:t>
+      </w:r>
+      <w:r>
+        <w:t xml:space="preserve">(or attach a file — see step 6), so opening New Request and</w:t>
+      </w:r>
+      <w:r>
+        <w:t xml:space="preserve"> </w:t>
+      </w:r>
+      <w:r>
+        <w:t xml:space="preserve">leaving creates nothing. (The request number is assigned when the draft is</w:t>
+      </w:r>
+      <w:r>
+        <w:t xml:space="preserve"> </w:t>
+      </w:r>
+      <w:r>
+        <w:t xml:space="preserve">first saved.)</w:t>
       </w:r>
     </w:p>
     <w:p>
@@ -1665,13 +1674,66 @@
           <w:b/>
           <w:bCs/>
         </w:rPr>
+        <w:t xml:space="preserve">Attachments</w:t>
+      </w:r>
+      <w:r>
+        <w:t xml:space="preserve"> </w:t>
+      </w:r>
+      <w:r>
+        <w:t xml:space="preserve">— upload supporting documents (quotes, evaluations, etc.)</w:t>
+      </w:r>
+      <w:r>
+        <w:t xml:space="preserve"> </w:t>
+      </w:r>
+      <w:r>
+        <w:t xml:space="preserve">and remove them. Any file type is accepted. On a brand-new request the</w:t>
+      </w:r>
+      <w:r>
+        <w:t xml:space="preserve"> </w:t>
+      </w:r>
+      <w:r>
+        <w:rPr>
+          <w:b/>
+          <w:bCs/>
+        </w:rPr>
+        <w:t xml:space="preserve">first upload saves the draft first</w:t>
+      </w:r>
+      <w:r>
+        <w:t xml:space="preserve">, then attaches the file.</w:t>
+      </w:r>
+      <w:r>
+        <w:t xml:space="preserve"> </w:t>
+      </w:r>
+      <w:r>
+        <w:t xml:space="preserve">Attachments can also be managed later from the request’s detail page while</w:t>
+      </w:r>
+      <w:r>
+        <w:t xml:space="preserve"> </w:t>
+      </w:r>
+      <w:r>
+        <w:t xml:space="preserve">it is a draft or rejected.</w:t>
+      </w:r>
+    </w:p>
+    <w:p>
+      <w:pPr>
+        <w:pStyle w:val="Compact"/>
+        <w:numPr>
+          <w:ilvl w:val="1"/>
+          <w:numId w:val="1005"/>
+        </w:numPr>
+      </w:pPr>
+      <w:r>
+        <w:rPr>
+          <w:b/>
+          <w:bCs/>
+        </w:rPr>
         <w:t xml:space="preserve">Review</w:t>
       </w:r>
       <w:r>
         <w:t xml:space="preserve"> </w:t>
       </w:r>
       <w:r>
-        <w:t xml:space="preserve">— check everything, then</w:t>
+        <w:t xml:space="preserve">— check everything (including the attachment count), then</w:t>
       </w:r>
       <w:r>
         <w:t xml:space="preserve"> </w:t>
@@ -17540,13 +17602,239 @@
       </w:tcPr>
     </w:tblStylePr>
   </w:style>
-  <w:style w:type="paragraph" w:customStyle="1" w:styleId="SourceCode">
+  <w:style w:customStyle="1" w:styleId="SourceCode" w:type="paragraph">
     <w:name w:val="Source Code"/>
     <w:basedOn w:val="Normal"/>
     <w:link w:val="VerbatimChar"/>
     <w:pPr>
       <w:wordWrap w:val="off"/>
     </w:pPr>
+  </w:style>
+  <w:style w:customStyle="1" w:styleId="KeywordTok" w:type="character">
+    <w:name w:val="KeywordTok"/>
+    <w:basedOn w:val="VerbatimChar"/>
+    <w:rPr>
+      <w:b/>
+      <w:color w:val="007020"/>
+    </w:rPr>
+  </w:style>
+  <w:style w:customStyle="1" w:styleId="DataTypeTok" w:type="character">
+    <w:name w:val="DataTypeTok"/>
+    <w:basedOn w:val="VerbatimChar"/>
+    <w:rPr>
+      <w:color w:val="902000"/>
+    </w:rPr>
+  </w:style>
+  <w:style w:customStyle="1" w:styleId="DecValTok" w:type="character">
+    <w:name w:val="DecValTok"/>
+    <w:basedOn w:val="VerbatimChar"/>
+    <w:rPr>
+      <w:color w:val="40a070"/>
+    </w:rPr>
+  </w:style>
+  <w:style w:customStyle="1" w:styleId="BaseNTok" w:type="character">
+    <w:name w:val="BaseNTok"/>
+    <w:basedOn w:val="VerbatimChar"/>
+    <w:rPr>
+      <w:color w:val="40a070"/>
+    </w:rPr>
+  </w:style>
+  <w:style w:customStyle="1" w:styleId="FloatTok" w:type="character">
+    <w:name w:val="FloatTok"/>
+    <w:basedOn w:val="VerbatimChar"/>
+    <w:rPr>
+      <w:color w:val="40a070"/>
+    </w:rPr>
+  </w:style>
+  <w:style w:customStyle="1" w:styleId="ConstantTok" w:type="character">
+    <w:name w:val="ConstantTok"/>
+    <w:basedOn w:val="VerbatimChar"/>
+    <w:rPr>
+      <w:color w:val="880000"/>
+    </w:rPr>
+  </w:style>
+  <w:style w:customStyle="1" w:styleId="CharTok" w:type="character">
+    <w:name w:val="CharTok"/>
+    <w:basedOn w:val="VerbatimChar"/>
+    <w:rPr>
+      <w:color w:val="4070a0"/>
+    </w:rPr>
+  </w:style>
+  <w:style w:customStyle="1" w:styleId="SpecialCharTok" w:type="character">
+    <w:name w:val="SpecialCharTok"/>
+    <w:basedOn w:val="VerbatimChar"/>
+    <w:rPr>
+      <w:color w:val="4070a0"/>
+    </w:rPr>
+  </w:style>
+  <w:style w:customStyle="1" w:styleId="StringTok" w:type="character">
+    <w:name w:val="StringTok"/>
+    <w:basedOn w:val="VerbatimChar"/>
+    <w:rPr>
+      <w:color w:val="4070a0"/>
+    </w:rPr>
+  </w:style>
+  <w:style w:customStyle="1" w:styleId="VerbatimStringTok" w:type="character">
+    <w:name w:val="VerbatimStringTok"/>
+    <w:basedOn w:val="VerbatimChar"/>
+    <w:rPr>
+      <w:color w:val="4070a0"/>
+    </w:rPr>
+  </w:style>
+  <w:style w:customStyle="1" w:styleId="SpecialStringTok" w:type="character">
+    <w:name w:val="SpecialStringTok"/>
+    <w:basedOn w:val="VerbatimChar"/>
+    <w:rPr>
+      <w:color w:val="bb6688"/>
+    </w:rPr>
+  </w:style>
+  <w:style w:customStyle="1" w:styleId="ImportTok" w:type="character">
+    <w:name w:val="ImportTok"/>
+    <w:basedOn w:val="VerbatimChar"/>
+    <w:rPr>
+      <w:b/>
+      <w:color w:val="008000"/>
+    </w:rPr>
+  </w:style>
+  <w:style w:customStyle="1" w:styleId="CommentTok" w:type="character">
+    <w:name w:val="CommentTok"/>
+    <w:basedOn w:val="VerbatimChar"/>
+    <w:rPr>
+      <w:i/>
+      <w:color w:val="60a0b0"/>
+    </w:rPr>
+  </w:style>
+  <w:style w:customStyle="1" w:styleId="DocumentationTok" w:type="character">
+    <w:name w:val="DocumentationTok"/>
+    <w:basedOn w:val="VerbatimChar"/>
+    <w:rPr>
+      <w:i/>
+      <w:color w:val="ba2121"/>
+    </w:rPr>
+  </w:style>
+  <w:style w:customStyle="1" w:styleId="AnnotationTok" w:type="character">
+    <w:name w:val="AnnotationTok"/>
+    <w:basedOn w:val="VerbatimChar"/>
+    <w:rPr>
+      <w:b/>
+      <w:i/>
+      <w:color w:val="60a0b0"/>
+    </w:rPr>
+  </w:style>
+  <w:style w:customStyle="1" w:styleId="CommentVarTok" w:type="character">
+    <w:name w:val="CommentVarTok"/>
+    <w:basedOn w:val="VerbatimChar"/>
+    <w:rPr>
+      <w:b/>
+      <w:i/>
+      <w:color w:val="60a0b0"/>
+    </w:rPr>
+  </w:style>
+  <w:style w:customStyle="1" w:styleId="OtherTok" w:type="character">
+    <w:name w:val="OtherTok"/>
+    <w:basedOn w:val="VerbatimChar"/>
+    <w:rPr>
+      <w:color w:val="007020"/>
+    </w:rPr>
+  </w:style>
+  <w:style w:customStyle="1" w:styleId="FunctionTok" w:type="character">
+    <w:name w:val="FunctionTok"/>
+    <w:basedOn w:val="VerbatimChar"/>
+    <w:rPr>
+      <w:color w:val="06287e"/>
+    </w:rPr>
+  </w:style>
+  <w:style w:customStyle="1" w:styleId="VariableTok" w:type="character">
+    <w:name w:val="VariableTok"/>
+    <w:basedOn w:val="VerbatimChar"/>
+    <w:rPr>
+      <w:color w:val="19177c"/>
+    </w:rPr>
+  </w:style>
+  <w:style w:customStyle="1" w:styleId="ControlFlowTok" w:type="character">
+    <w:name w:val="ControlFlowTok"/>
+    <w:basedOn w:val="VerbatimChar"/>
+    <w:rPr>
+      <w:b/>
+      <w:color w:val="007020"/>
+    </w:rPr>
+  </w:style>
+  <w:style w:customStyle="1" w:styleId="OperatorTok" w:type="character">
+    <w:name w:val="OperatorTok"/>
+    <w:basedOn w:val="VerbatimChar"/>
+    <w:rPr>
+      <w:color w:val="666666"/>
+    </w:rPr>
+  </w:style>
+  <w:style w:customStyle="1" w:styleId="BuiltInTok" w:type="character">
+    <w:name w:val="BuiltInTok"/>
+    <w:basedOn w:val="VerbatimChar"/>
+    <w:rPr>
+      <w:color w:val="008000"/>
+    </w:rPr>
+  </w:style>
+  <w:style w:customStyle="1" w:styleId="ExtensionTok" w:type="character">
+    <w:name w:val="ExtensionTok"/>
+    <w:basedOn w:val="VerbatimChar"/>
+    <w:rPr/>
+  </w:style>
+  <w:style w:customStyle="1" w:styleId="PreprocessorTok" w:type="character">
+    <w:name w:val="PreprocessorTok"/>
+    <w:basedOn w:val="VerbatimChar"/>
+    <w:rPr>
+      <w:color w:val="bc7a00"/>
+    </w:rPr>
+  </w:style>
+  <w:style w:customStyle="1" w:styleId="AttributeTok" w:type="character">
+    <w:name w:val="AttributeTok"/>
+    <w:basedOn w:val="VerbatimChar"/>
+    <w:rPr>
+      <w:color w:val="7d9029"/>
+    </w:rPr>
+  </w:style>
+  <w:style w:customStyle="1" w:styleId="RegionMarkerTok" w:type="character">
+    <w:name w:val="RegionMarkerTok"/>
+    <w:basedOn w:val="VerbatimChar"/>
+    <w:rPr/>
+  </w:style>
+  <w:style w:customStyle="1" w:styleId="InformationTok" w:type="character">
+    <w:name w:val="InformationTok"/>
+    <w:basedOn w:val="VerbatimChar"/>
+    <w:rPr>
+      <w:b/>
+      <w:i/>
+      <w:color w:val="60a0b0"/>
+    </w:rPr>
+  </w:style>
+  <w:style w:customStyle="1" w:styleId="WarningTok" w:type="character">
+    <w:name w:val="WarningTok"/>
+    <w:basedOn w:val="VerbatimChar"/>
+    <w:rPr>
+      <w:b/>
+      <w:i/>
+      <w:color w:val="60a0b0"/>
+    </w:rPr>
+  </w:style>
+  <w:style w:customStyle="1" w:styleId="AlertTok" w:type="character">
+    <w:name w:val="AlertTok"/>
+    <w:basedOn w:val="VerbatimChar"/>
+    <w:rPr>
+      <w:b/>
+      <w:color w:val="ff0000"/>
+    </w:rPr>
+  </w:style>
+  <w:style w:customStyle="1" w:styleId="ErrorTok" w:type="character">
+    <w:name w:val="ErrorTok"/>
+    <w:basedOn w:val="VerbatimChar"/>
+    <w:rPr>
+      <w:b/>
+      <w:color w:val="ff0000"/>
+    </w:rPr>
+  </w:style>
+  <w:style w:customStyle="1" w:styleId="NormalTok" w:type="character">
+    <w:name w:val="NormalTok"/>
+    <w:basedOn w:val="VerbatimChar"/>
+    <w:rPr/>
   </w:style>
   <w:style w:type="character" w:customStyle="1" w:styleId="KeywordTok">
     <w:name w:val="KeywordTok"/>

</xml_diff>